<commit_message>
feat: add Alibaba Cloud certification and align technical skills with AI/DS/ML projects
</commit_message>
<xml_diff>
--- a/output/en/Resume_AI_Engineer.docx
+++ b/output/en/Resume_AI_Engineer.docx
@@ -1610,7 +1610,7 @@
           <w:color w:val="0F172A"/>
           <w:sz w:val="19"/>
         </w:rPr>
-        <w:t xml:space="preserve">Computer Vision &amp; OCR: </w:t>
+        <w:t xml:space="preserve">Deep Learning &amp; Computer Vision: </w:t>
       </w:r>
       <w:r>
         <w:rPr>
@@ -1618,7 +1618,7 @@
           <w:color w:val="1E293B"/>
           <w:sz w:val="19"/>
         </w:rPr>
-        <w:t>OpenCV, YOLO (v8/v11), PaddleOCR, Tesseract OCR, TensorFlow / Keras (CNN), Image Preprocessing, Object Detection</w:t>
+        <w:t>TensorFlow (2.15+), Keras 3, Convolutional Neural Networks (CNN), OpenCV, ImageDataGenerator, Image Augmentation (Pillow/PIL), Callbacks (EarlyStopping, ModelCheckpoint), .keras Model Serialization &amp; CLI Inference</w:t>
       </w:r>
     </w:p>
     <w:p>
@@ -1632,7 +1632,7 @@
           <w:color w:val="0F172A"/>
           <w:sz w:val="19"/>
         </w:rPr>
-        <w:t xml:space="preserve">AI, ML &amp; Edge Optimization: </w:t>
+        <w:t xml:space="preserve">Machine Learning &amp; Predictive Modeling: </w:t>
       </w:r>
       <w:r>
         <w:rPr>
@@ -1640,7 +1640,7 @@
           <w:color w:val="1E293B"/>
           <w:sz w:val="19"/>
         </w:rPr>
-        <w:t>Predictive Modeling, Statistical Analysis, Scikit-learn, Model Quantization (TFLite / ONNX), Edge Inference (Android / Mobile Devices), RAG Pipelines</w:t>
+        <w:t>Scikit-Learn, Supervised Learning (Decision Tree, SVM/SVC, SVR, Logistic &amp; Linear Regression), Unsupervised Learning (K-Means Clustering, Elbow Method), PCA (Dimensionality Reduction), Hyperparameter Tuning (GridSearchCV), K-Fold Cross-Validation</w:t>
       </w:r>
     </w:p>
     <w:p>
@@ -1654,7 +1654,7 @@
           <w:color w:val="0F172A"/>
           <w:sz w:val="19"/>
         </w:rPr>
-        <w:t xml:space="preserve">Data Pipelines &amp; MLOps: </w:t>
+        <w:t xml:space="preserve">Data Science, Statistics &amp; Visualization: </w:t>
       </w:r>
       <w:r>
         <w:rPr>
@@ -1662,7 +1662,7 @@
           <w:color w:val="1E293B"/>
           <w:sz w:val="19"/>
         </w:rPr>
-        <w:t>Python (NumPy, Pandas, Matplotlib), SQL (PostgreSQL, MySQL), MLflow, Apache Airflow, Docker, Linux/SSH, Git / GitHub Actions</w:t>
+        <w:t>Python (Pandas, NumPy, SciPy), Descriptive Statistics &amp; Outlier Detection (IQR, Skewness, Variance), Data Wrangling &amp; Feature Engineering, Matplotlib, Seaborn, Interactive Dashboards (Streamlit, Recharts), Jupyter Notebook, Google Colab</w:t>
       </w:r>
     </w:p>
     <w:p>
@@ -1676,7 +1676,7 @@
           <w:color w:val="0F172A"/>
           <w:sz w:val="19"/>
         </w:rPr>
-        <w:t xml:space="preserve">APIs &amp; Operational Integration: </w:t>
+        <w:t xml:space="preserve">Cloud &amp; Production Environments: </w:t>
       </w:r>
       <w:r>
         <w:rPr>
@@ -1684,7 +1684,7 @@
           <w:color w:val="1E293B"/>
           <w:sz w:val="19"/>
         </w:rPr>
-        <w:t>RESTful &amp; GraphQL APIs, KoboToolbox API Integration, Live Operational Dashboards (WebSockets, SSE), FastAPI, Flask, Redis</w:t>
+        <w:t>Alibaba Cloud (Certified Developer), Google Cloud Platform (GCE, Cloud Storage), Docker, Linux/SSH, Git / GitHub Actions, RESTful &amp; GraphQL APIs, SQL (PostgreSQL, MySQL)</w:t>
       </w:r>
     </w:p>
     <w:p>
@@ -1698,7 +1698,7 @@
           <w:color w:val="0F172A"/>
           <w:sz w:val="19"/>
         </w:rPr>
-        <w:t xml:space="preserve">Mobile &amp; Edge Platform: </w:t>
+        <w:t xml:space="preserve">Edge &amp; Systems Integration: </w:t>
       </w:r>
       <w:r>
         <w:rPr>
@@ -1706,7 +1706,7 @@
           <w:color w:val="1E293B"/>
           <w:sz w:val="19"/>
         </w:rPr>
-        <w:t>Android Jetpack (Kotlin/Java), Room SQLite, Offline-first Caching, Memory Leak Profiling, ProGuard/R8 Optimization</w:t>
+        <w:t>Mobile Edge Inference (Android Jetpack, Kotlin/Java), Room SQLite, Offline-first Caching, Real-Time WebSockets (Pusher JS), Live Operational Dashboard Integration</w:t>
       </w:r>
     </w:p>
     <w:p>
@@ -1821,6 +1821,85 @@
           <w:sz w:val="21"/>
         </w:rPr>
         <w:t>CERTIFICATIONS</w:t>
+      </w:r>
+    </w:p>
+    <w:tbl>
+      <w:tblPr>
+        <w:tblW w:type="auto" w:w="0"/>
+        <w:jc w:val="center"/>
+        <w:tblLayout w:type="fixed"/>
+        <w:tblLook w:firstColumn="1" w:firstRow="1" w:lastColumn="0" w:lastRow="0" w:noHBand="0" w:noVBand="1" w:val="04A0"/>
+      </w:tblPr>
+      <w:tblGrid>
+        <w:gridCol w:w="5400"/>
+        <w:gridCol w:w="5400"/>
+      </w:tblGrid>
+      <w:tr>
+        <w:tc>
+          <w:tcPr>
+            <w:tcW w:type="dxa" w:w="7632"/>
+            <w:tcMar>
+              <w:top w:w="0" w:type="dxa"/>
+              <w:bottom w:w="0" w:type="dxa"/>
+              <w:left w:w="0" w:type="dxa"/>
+              <w:right w:w="0" w:type="dxa"/>
+            </w:tcMar>
+          </w:tcPr>
+          <w:p>
+            <w:pPr>
+              <w:spacing w:before="40" w:after="20" w:line="252" w:lineRule="auto"/>
+            </w:pPr>
+            <w:r>
+              <w:rPr>
+                <w:rFonts w:ascii="Calibri" w:hAnsi="Calibri"/>
+                <w:b/>
+                <w:color w:val="0F172A"/>
+                <w:sz w:val="20"/>
+              </w:rPr>
+              <w:t>Alibaba Cloud Certified Developer | Alibaba Cloud</w:t>
+            </w:r>
+          </w:p>
+        </w:tc>
+        <w:tc>
+          <w:tcPr>
+            <w:tcW w:type="dxa" w:w="3168"/>
+            <w:tcMar>
+              <w:top w:w="0" w:type="dxa"/>
+              <w:bottom w:w="0" w:type="dxa"/>
+              <w:left w:w="0" w:type="dxa"/>
+              <w:right w:w="0" w:type="dxa"/>
+            </w:tcMar>
+          </w:tcPr>
+          <w:p>
+            <w:pPr>
+              <w:spacing w:before="40" w:after="20" w:line="252" w:lineRule="auto"/>
+              <w:jc w:val="right"/>
+            </w:pPr>
+            <w:r>
+              <w:rPr>
+                <w:rFonts w:ascii="Calibri" w:hAnsi="Calibri"/>
+                <w:i/>
+                <w:color w:val="475569"/>
+                <w:sz w:val="19"/>
+              </w:rPr>
+              <w:t>Jul 2023 – Jul 2026</w:t>
+            </w:r>
+          </w:p>
+        </w:tc>
+      </w:tr>
+    </w:tbl>
+    <w:p>
+      <w:pPr>
+        <w:spacing w:before="0" w:after="40"/>
+        <w:ind w:left="216"/>
+      </w:pPr>
+      <w:r>
+        <w:rPr>
+          <w:rFonts w:ascii="Calibri" w:hAnsi="Calibri"/>
+          <w:color w:val="475569"/>
+          <w:sz w:val="18"/>
+        </w:rPr>
+        <w:t>Core Focus: Cloud Architecture, Cloud Application Development, Container &amp; Compute Services, Scalable Deployment</w:t>
       </w:r>
     </w:p>
     <w:tbl>

</xml_diff>